<commit_message>
edited captioned joined video
</commit_message>
<xml_diff>
--- a/Documentation.docx
+++ b/Documentation.docx
@@ -45,21 +45,7 @@
         <w:rPr>
           <w:color w:val="000000"/>
         </w:rPr>
-        <w:t xml:space="preserve">Source code, </w:t>
-      </w:r>
-      <w:proofErr w:type="spellStart"/>
-      <w:r>
-        <w:rPr>
-          <w:color w:val="000000"/>
-        </w:rPr>
-        <w:t>Github</w:t>
-      </w:r>
-      <w:proofErr w:type="spellEnd"/>
-      <w:r>
-        <w:rPr>
-          <w:color w:val="000000"/>
-        </w:rPr>
-        <w:t xml:space="preserve"> repositories, service URI scheme, screen shots of app, cloud deployment settings, testing report, division of work between team members.</w:t>
+        <w:t>Source code, Github repositories, service URI scheme, screen shots of app, cloud deployment settings, testing report, division of work between team members.</w:t>
       </w:r>
     </w:p>
     <w:p/>
@@ -126,13 +112,8 @@
     </w:p>
     <w:p/>
     <w:p>
-      <w:proofErr w:type="spellStart"/>
-      <w:r>
-        <w:t>Internationalsation</w:t>
-      </w:r>
-      <w:proofErr w:type="spellEnd"/>
-      <w:r>
-        <w:t xml:space="preserve"> </w:t>
+      <w:r>
+        <w:t xml:space="preserve">Internationalsation </w:t>
       </w:r>
     </w:p>
     <w:p>
@@ -363,29 +344,7 @@
           <w:shd w:val="clear" w:color="auto" w:fill="1F1F1F"/>
           <w14:ligatures w14:val="none"/>
         </w:rPr>
-        <w:t xml:space="preserve">  │ </w:t>
-      </w:r>
-      <w:proofErr w:type="spellStart"/>
-      <w:r>
-        <w:rPr>
-          <w:rFonts w:ascii="Cascadia Mono" w:eastAsia="Times New Roman" w:hAnsi="Cascadia Mono" w:cs="Times New Roman"/>
-          <w:color w:val="FAFAFA"/>
-          <w:kern w:val="0"/>
-          <w:shd w:val="clear" w:color="auto" w:fill="1F1F1F"/>
-          <w14:ligatures w14:val="none"/>
-        </w:rPr>
-        <w:t>OpenAPI</w:t>
-      </w:r>
-      <w:proofErr w:type="spellEnd"/>
-      <w:r>
-        <w:rPr>
-          <w:rFonts w:ascii="Cascadia Mono" w:eastAsia="Times New Roman" w:hAnsi="Cascadia Mono" w:cs="Times New Roman"/>
-          <w:color w:val="FAFAFA"/>
-          <w:kern w:val="0"/>
-          <w:shd w:val="clear" w:color="auto" w:fill="1F1F1F"/>
-          <w14:ligatures w14:val="none"/>
-        </w:rPr>
-        <w:t xml:space="preserve"> / Swagger              │ Done                  │</w:t>
+        <w:t xml:space="preserve">  │ OpenAPI / Swagger              │ Done                  │</w:t>
       </w:r>
       <w:r>
         <w:rPr>
@@ -538,15 +497,7 @@
         <w:pStyle w:val="Heading2"/>
       </w:pPr>
       <w:r>
-        <w:t xml:space="preserve">A meal planning rest </w:t>
-      </w:r>
-      <w:proofErr w:type="spellStart"/>
-      <w:r>
-        <w:t>api</w:t>
-      </w:r>
-      <w:proofErr w:type="spellEnd"/>
-      <w:r>
-        <w:t xml:space="preserve"> built with ASP Core backed by an Azure SQL database and server and deployed to Azure App Service.</w:t>
+        <w:t>A meal planning rest api built with ASP Core backed by an Azure SQL database and server and deployed to Azure App Service.</w:t>
       </w:r>
     </w:p>
     <w:p/>
@@ -559,13 +510,8 @@
           <w:bottom w:val="single" w:sz="6" w:space="1" w:color="auto"/>
         </w:pBdr>
       </w:pPr>
-      <w:proofErr w:type="spellStart"/>
-      <w:r>
-        <w:t>Github</w:t>
-      </w:r>
-      <w:proofErr w:type="spellEnd"/>
-      <w:r>
-        <w:t xml:space="preserve"> repos / Source Code </w:t>
+      <w:r>
+        <w:t xml:space="preserve">Github repos / Source Code </w:t>
       </w:r>
     </w:p>
     <w:p/>
@@ -584,7 +530,6 @@
         </w:rPr>
       </w:pPr>
       <w:hyperlink r:id="rId6" w:history="1">
-        <w:proofErr w:type="spellStart"/>
         <w:r>
           <w:rPr>
             <w:rStyle w:val="Hyperlink"/>
@@ -592,9 +537,27 @@
             <w:sz w:val="20"/>
             <w:szCs w:val="20"/>
           </w:rPr>
-          <w:t>macmacmccann</w:t>
+          <w:t>macmacmccann/CA1_BackEnd_AspCore</w:t>
         </w:r>
-        <w:proofErr w:type="spellEnd"/>
+      </w:hyperlink>
+    </w:p>
+    <w:p>
+      <w:pPr>
+        <w:pStyle w:val="Heading4"/>
+      </w:pPr>
+      <w:r>
+        <w:t xml:space="preserve">FRONT END ANDROID   </w:t>
+      </w:r>
+    </w:p>
+    <w:p>
+      <w:pPr>
+        <w:rPr>
+          <w:color w:val="3A7C22" w:themeColor="accent6" w:themeShade="BF"/>
+          <w:sz w:val="20"/>
+          <w:szCs w:val="20"/>
+        </w:rPr>
+      </w:pPr>
+      <w:hyperlink r:id="rId7" w:history="1">
         <w:r>
           <w:rPr>
             <w:rStyle w:val="Hyperlink"/>
@@ -602,46 +565,7 @@
             <w:sz w:val="20"/>
             <w:szCs w:val="20"/>
           </w:rPr>
-          <w:t>/CA1_BackEnd_AspCore</w:t>
-        </w:r>
-      </w:hyperlink>
-    </w:p>
-    <w:p>
-      <w:pPr>
-        <w:pStyle w:val="Heading4"/>
-      </w:pPr>
-      <w:r>
-        <w:t xml:space="preserve">FRONT END ANDROID   </w:t>
-      </w:r>
-    </w:p>
-    <w:p>
-      <w:pPr>
-        <w:rPr>
-          <w:color w:val="3A7C22" w:themeColor="accent6" w:themeShade="BF"/>
-          <w:sz w:val="20"/>
-          <w:szCs w:val="20"/>
-        </w:rPr>
-      </w:pPr>
-      <w:hyperlink r:id="rId7" w:history="1">
-        <w:proofErr w:type="spellStart"/>
-        <w:r>
-          <w:rPr>
-            <w:rStyle w:val="Hyperlink"/>
-            <w:color w:val="3A7C22" w:themeColor="accent6" w:themeShade="BF"/>
-            <w:sz w:val="20"/>
-            <w:szCs w:val="20"/>
-          </w:rPr>
-          <w:t>DaemonCullen</w:t>
-        </w:r>
-        <w:proofErr w:type="spellEnd"/>
-        <w:r>
-          <w:rPr>
-            <w:rStyle w:val="Hyperlink"/>
-            <w:color w:val="3A7C22" w:themeColor="accent6" w:themeShade="BF"/>
-            <w:sz w:val="20"/>
-            <w:szCs w:val="20"/>
-          </w:rPr>
-          <w:t>/SA-CA-2026-Frontend: Meals app by Daemon Cullen (X00182575) and Mark Mc Cann (X00202859)</w:t>
+          <w:t>DaemonCullen/SA-CA-2026-Frontend: Meals app by Daemon Cullen (X00182575) and Mark Mc Cann (X00202859)</w:t>
         </w:r>
       </w:hyperlink>
     </w:p>
@@ -688,28 +612,7 @@
           <w:sz w:val="32"/>
           <w:szCs w:val="32"/>
         </w:rPr>
-        <w:t>C</w:t>
-      </w:r>
-      <w:r>
-        <w:rPr>
-          <w:sz w:val="32"/>
-          <w:szCs w:val="32"/>
-        </w:rPr>
-        <w:t xml:space="preserve">loud deployment </w:t>
-      </w:r>
-      <w:r>
-        <w:rPr>
-          <w:sz w:val="32"/>
-          <w:szCs w:val="32"/>
-        </w:rPr>
-        <w:t>S</w:t>
-      </w:r>
-      <w:r>
-        <w:rPr>
-          <w:sz w:val="32"/>
-          <w:szCs w:val="32"/>
-        </w:rPr>
-        <w:t>ettings</w:t>
+        <w:t>Cloud deployment Settings</w:t>
       </w:r>
     </w:p>
     <w:p/>
@@ -769,15 +672,7 @@
         <w:spacing w:after="0"/>
       </w:pPr>
       <w:r>
-        <w:t xml:space="preserve">Security is managed with environmental variables and </w:t>
-      </w:r>
-      <w:proofErr w:type="spellStart"/>
-      <w:r>
-        <w:t>sql</w:t>
-      </w:r>
-      <w:proofErr w:type="spellEnd"/>
-      <w:r>
-        <w:t xml:space="preserve"> authentication in the base code .</w:t>
+        <w:t>Security is managed with environmental variables and sql authentication in the base code .</w:t>
       </w:r>
     </w:p>
     <w:p/>
@@ -788,34 +683,13 @@
           <w:bottom w:val="single" w:sz="6" w:space="1" w:color="auto"/>
         </w:pBdr>
       </w:pPr>
-      <w:proofErr w:type="spellStart"/>
-      <w:r>
-        <w:t>OpenAPI</w:t>
-      </w:r>
-      <w:proofErr w:type="spellEnd"/>
-      <w:r>
-        <w:t xml:space="preserve"> / Swagger</w:t>
-      </w:r>
-    </w:p>
-    <w:p>
-      <w:r>
-        <w:t xml:space="preserve">The API provides </w:t>
-      </w:r>
-      <w:proofErr w:type="spellStart"/>
-      <w:r>
-        <w:t>OpenAPI</w:t>
-      </w:r>
-      <w:proofErr w:type="spellEnd"/>
-      <w:r>
-        <w:t xml:space="preserve"> metadata via </w:t>
-      </w:r>
-      <w:proofErr w:type="spellStart"/>
-      <w:r>
-        <w:t>Swashbuckle</w:t>
-      </w:r>
-      <w:proofErr w:type="spellEnd"/>
-      <w:r>
-        <w:t>. The Swagger UI is available at the root URL and lists all available endpoints with request/response schemas. It can be used to test endpoints directly in the browser.</w:t>
+      <w:r>
+        <w:t>OpenAPI / Swagger</w:t>
+      </w:r>
+    </w:p>
+    <w:p>
+      <w:r>
+        <w:t>The API provides OpenAPI metadata via Swashbuckle. The Swagger UI is available at the root URL and lists all available endpoints with request/response schemas. It can be used to test endpoints directly in the browser.</w:t>
       </w:r>
     </w:p>
     <w:p>
@@ -834,15 +708,7 @@
         <w:spacing w:after="0"/>
       </w:pPr>
       <w:r>
-        <w:t>A GitHub Actions pipeline is configured in .</w:t>
-      </w:r>
-      <w:proofErr w:type="spellStart"/>
-      <w:r>
-        <w:t>github</w:t>
-      </w:r>
-      <w:proofErr w:type="spellEnd"/>
-      <w:r>
-        <w:t xml:space="preserve">/workflows/  </w:t>
+        <w:t xml:space="preserve">A GitHub Actions pipeline is configured in .github/workflows/  </w:t>
       </w:r>
     </w:p>
     <w:p>
@@ -882,15 +748,7 @@
         <w:spacing w:after="0"/>
       </w:pPr>
       <w:r>
-        <w:t xml:space="preserve">The pipeline also imports the </w:t>
-      </w:r>
-      <w:proofErr w:type="spellStart"/>
-      <w:r>
-        <w:t>OpenAPI</w:t>
-      </w:r>
-      <w:proofErr w:type="spellEnd"/>
-      <w:r>
-        <w:t xml:space="preserve"> specification into Azure API Management on each deployment.  </w:t>
+        <w:t xml:space="preserve">The pipeline also imports the OpenAPI specification into Azure API Management on each deployment.  </w:t>
       </w:r>
     </w:p>
     <w:p/>
@@ -976,15 +834,7 @@
           </w:tcPr>
           <w:p>
             <w:r>
-              <w:t xml:space="preserve">Daemon ( </w:t>
-            </w:r>
-            <w:proofErr w:type="spellStart"/>
-            <w:r>
-              <w:t>FrontEnd</w:t>
-            </w:r>
-            <w:proofErr w:type="spellEnd"/>
-            <w:r>
-              <w:t xml:space="preserve"> Role ) </w:t>
+              <w:t xml:space="preserve">Daemon ( FrontEnd Role ) </w:t>
             </w:r>
           </w:p>
         </w:tc>
@@ -1027,11 +877,9 @@
             <w:tcW w:w="4675" w:type="dxa"/>
           </w:tcPr>
           <w:p>
-            <w:proofErr w:type="spellStart"/>
             <w:r>
               <w:t>Internationlisation</w:t>
             </w:r>
-            <w:proofErr w:type="spellEnd"/>
           </w:p>
         </w:tc>
       </w:tr>
@@ -1142,13 +990,8 @@
             <w:tcW w:w="4675" w:type="dxa"/>
           </w:tcPr>
           <w:p>
-            <w:proofErr w:type="spellStart"/>
             <w:r>
-              <w:t>RetroFit</w:t>
-            </w:r>
-            <w:proofErr w:type="spellEnd"/>
-            <w:r>
-              <w:t xml:space="preserve"> Endpoints </w:t>
+              <w:t xml:space="preserve">RetroFit Endpoints </w:t>
             </w:r>
           </w:p>
         </w:tc>
@@ -1232,13 +1075,8 @@
         <w:t>SQL Database</w:t>
       </w:r>
       <w:r>
-        <w:t xml:space="preserve"> Code First Entity </w:t>
-      </w:r>
-      <w:proofErr w:type="spellStart"/>
-      <w:r>
-        <w:t>Framwork</w:t>
-      </w:r>
-      <w:proofErr w:type="spellEnd"/>
+        <w:t xml:space="preserve"> Code First Entity Framwork</w:t>
+      </w:r>
     </w:p>
     <w:p>
       <w:r>
@@ -1332,15 +1170,7 @@
     </w:p>
     <w:p>
       <w:r>
-        <w:t xml:space="preserve"> The `Meals` table has an optional foreign key (`</w:t>
-      </w:r>
-      <w:proofErr w:type="spellStart"/>
-      <w:r>
-        <w:t>PlanId</w:t>
-      </w:r>
-      <w:proofErr w:type="spellEnd"/>
-      <w:r>
-        <w:t>`) linking each meal to a plan : a one-to-many relationship between Plans and Meals.</w:t>
+        <w:t xml:space="preserve"> The `Meals` table has an optional foreign key (`PlanId`) linking each meal to a plan : a one-to-many relationship between Plans and Meals.</w:t>
       </w:r>
     </w:p>
     <w:p>
@@ -1352,40 +1182,22 @@
       <w:r>
         <w:t xml:space="preserve">Models are defined in C# and migrations are generated using the EF Core tools.  Seed data for meals, plans, and ingredients is defined in </w:t>
       </w:r>
-      <w:proofErr w:type="spellStart"/>
       <w:r>
         <w:rPr>
           <w:i/>
           <w:iCs/>
         </w:rPr>
-        <w:t>AppDbContext.OnModelCreating</w:t>
-      </w:r>
-      <w:proofErr w:type="spellEnd"/>
+        <w:t xml:space="preserve">AppDbContext.OnModelCreating </w:t>
+      </w:r>
+      <w:r>
+        <w:t xml:space="preserve">  and applied automatically on startup </w:t>
+      </w:r>
       <w:r>
         <w:rPr>
           <w:i/>
           <w:iCs/>
         </w:rPr>
-        <w:t xml:space="preserve"> </w:t>
-      </w:r>
-      <w:r>
-        <w:t xml:space="preserve">  and applied automatically on startup </w:t>
-      </w:r>
-      <w:proofErr w:type="spellStart"/>
-      <w:r>
-        <w:rPr>
-          <w:i/>
-          <w:iCs/>
-        </w:rPr>
-        <w:t>db.Database.Migrate</w:t>
-      </w:r>
-      <w:proofErr w:type="spellEnd"/>
-      <w:r>
-        <w:rPr>
-          <w:i/>
-          <w:iCs/>
-        </w:rPr>
-        <w:t>()</w:t>
+        <w:t>db.Database.Migrate()</w:t>
       </w:r>
     </w:p>
     <w:p/>
@@ -1446,599 +1258,231 @@
           <w:sz w:val="20"/>
           <w:szCs w:val="20"/>
         </w:rPr>
-        <w:t>| GET | /</w:t>
-      </w:r>
-      <w:proofErr w:type="spellStart"/>
-      <w:r>
-        <w:rPr>
-          <w:sz w:val="20"/>
-          <w:szCs w:val="20"/>
-        </w:rPr>
-        <w:t>api</w:t>
-      </w:r>
-      <w:proofErr w:type="spellEnd"/>
-      <w:r>
-        <w:rPr>
-          <w:sz w:val="20"/>
-          <w:szCs w:val="20"/>
-        </w:rPr>
-        <w:t>/meals | Get all meals |</w:t>
-      </w:r>
-    </w:p>
-    <w:p>
-      <w:pPr>
-        <w:spacing w:after="0"/>
-        <w:rPr>
-          <w:sz w:val="20"/>
-          <w:szCs w:val="20"/>
-        </w:rPr>
-      </w:pPr>
-      <w:r>
-        <w:rPr>
-          <w:sz w:val="20"/>
-          <w:szCs w:val="20"/>
-        </w:rPr>
-        <w:t>| GET | /</w:t>
-      </w:r>
-      <w:proofErr w:type="spellStart"/>
-      <w:r>
-        <w:rPr>
-          <w:sz w:val="20"/>
-          <w:szCs w:val="20"/>
-        </w:rPr>
-        <w:t>api</w:t>
-      </w:r>
-      <w:proofErr w:type="spellEnd"/>
-      <w:r>
-        <w:rPr>
-          <w:sz w:val="20"/>
-          <w:szCs w:val="20"/>
-        </w:rPr>
-        <w:t>/meals/{id} | Get meal by ID |</w:t>
-      </w:r>
-    </w:p>
-    <w:p>
-      <w:pPr>
-        <w:spacing w:after="0"/>
-        <w:rPr>
-          <w:sz w:val="20"/>
-          <w:szCs w:val="20"/>
-        </w:rPr>
-      </w:pPr>
-      <w:r>
-        <w:rPr>
-          <w:sz w:val="20"/>
-          <w:szCs w:val="20"/>
-        </w:rPr>
-        <w:t>| GET | /</w:t>
-      </w:r>
-      <w:proofErr w:type="spellStart"/>
-      <w:r>
-        <w:rPr>
-          <w:sz w:val="20"/>
-          <w:szCs w:val="20"/>
-        </w:rPr>
-        <w:t>api</w:t>
-      </w:r>
-      <w:proofErr w:type="spellEnd"/>
-      <w:r>
-        <w:rPr>
-          <w:sz w:val="20"/>
-          <w:szCs w:val="20"/>
-        </w:rPr>
-        <w:t>/meals/search/name/{name} | Search meals by name |</w:t>
-      </w:r>
-    </w:p>
-    <w:p>
-      <w:pPr>
-        <w:spacing w:after="0"/>
-        <w:rPr>
-          <w:sz w:val="20"/>
-          <w:szCs w:val="20"/>
-        </w:rPr>
-      </w:pPr>
-      <w:r>
-        <w:rPr>
-          <w:sz w:val="20"/>
-          <w:szCs w:val="20"/>
-        </w:rPr>
-        <w:t>| GET | /</w:t>
-      </w:r>
-      <w:proofErr w:type="spellStart"/>
-      <w:r>
-        <w:rPr>
-          <w:sz w:val="20"/>
-          <w:szCs w:val="20"/>
-        </w:rPr>
-        <w:t>api</w:t>
-      </w:r>
-      <w:proofErr w:type="spellEnd"/>
-      <w:r>
-        <w:rPr>
-          <w:sz w:val="20"/>
-          <w:szCs w:val="20"/>
-        </w:rPr>
-        <w:t>/meals/search/category/{category} | Filter by category |</w:t>
-      </w:r>
-    </w:p>
-    <w:p>
-      <w:pPr>
-        <w:spacing w:after="0"/>
-        <w:rPr>
-          <w:sz w:val="20"/>
-          <w:szCs w:val="20"/>
-        </w:rPr>
-      </w:pPr>
-      <w:r>
-        <w:rPr>
-          <w:sz w:val="20"/>
-          <w:szCs w:val="20"/>
-        </w:rPr>
-        <w:t>| GET | /</w:t>
-      </w:r>
-      <w:proofErr w:type="spellStart"/>
-      <w:r>
-        <w:rPr>
-          <w:sz w:val="20"/>
-          <w:szCs w:val="20"/>
-        </w:rPr>
-        <w:t>api</w:t>
-      </w:r>
-      <w:proofErr w:type="spellEnd"/>
-      <w:r>
-        <w:rPr>
-          <w:sz w:val="20"/>
-          <w:szCs w:val="20"/>
-        </w:rPr>
-        <w:t>/meals/search/difficulty/{difficulty} | Filter by difficulty |</w:t>
-      </w:r>
-    </w:p>
-    <w:p>
-      <w:pPr>
-        <w:spacing w:after="0"/>
-        <w:rPr>
-          <w:sz w:val="20"/>
-          <w:szCs w:val="20"/>
-        </w:rPr>
-      </w:pPr>
-      <w:r>
-        <w:rPr>
-          <w:sz w:val="20"/>
-          <w:szCs w:val="20"/>
-        </w:rPr>
-        <w:t>| GET | /</w:t>
-      </w:r>
-      <w:proofErr w:type="spellStart"/>
-      <w:r>
-        <w:rPr>
-          <w:sz w:val="20"/>
-          <w:szCs w:val="20"/>
-        </w:rPr>
-        <w:t>api</w:t>
-      </w:r>
-      <w:proofErr w:type="spellEnd"/>
-      <w:r>
-        <w:rPr>
-          <w:sz w:val="20"/>
-          <w:szCs w:val="20"/>
-        </w:rPr>
-        <w:t>/meals/search/rating/{rating} | Filter by rating |</w:t>
-      </w:r>
-    </w:p>
-    <w:p>
-      <w:pPr>
-        <w:spacing w:after="0"/>
-        <w:rPr>
-          <w:sz w:val="20"/>
-          <w:szCs w:val="20"/>
-        </w:rPr>
-      </w:pPr>
-      <w:r>
-        <w:rPr>
-          <w:sz w:val="20"/>
-          <w:szCs w:val="20"/>
-        </w:rPr>
-        <w:t>| GET | /</w:t>
-      </w:r>
-      <w:proofErr w:type="spellStart"/>
-      <w:r>
-        <w:rPr>
-          <w:sz w:val="20"/>
-          <w:szCs w:val="20"/>
-        </w:rPr>
-        <w:t>api</w:t>
-      </w:r>
-      <w:proofErr w:type="spellEnd"/>
-      <w:r>
-        <w:rPr>
-          <w:sz w:val="20"/>
-          <w:szCs w:val="20"/>
-        </w:rPr>
-        <w:t>/meals/search/calories/{calories} | Filter by calories |</w:t>
-      </w:r>
-    </w:p>
-    <w:p>
-      <w:pPr>
-        <w:spacing w:after="0"/>
-        <w:rPr>
-          <w:sz w:val="20"/>
-          <w:szCs w:val="20"/>
-        </w:rPr>
-      </w:pPr>
-      <w:r>
-        <w:rPr>
-          <w:sz w:val="20"/>
-          <w:szCs w:val="20"/>
-        </w:rPr>
-        <w:t>| GET | /</w:t>
-      </w:r>
-      <w:proofErr w:type="spellStart"/>
-      <w:r>
-        <w:rPr>
-          <w:sz w:val="20"/>
-          <w:szCs w:val="20"/>
-        </w:rPr>
-        <w:t>api</w:t>
-      </w:r>
-      <w:proofErr w:type="spellEnd"/>
-      <w:r>
-        <w:rPr>
-          <w:sz w:val="20"/>
-          <w:szCs w:val="20"/>
-        </w:rPr>
-        <w:t>/meals/search/protein/{protein} | Filter by protein |</w:t>
-      </w:r>
-    </w:p>
-    <w:p>
-      <w:pPr>
-        <w:spacing w:after="0"/>
-        <w:rPr>
-          <w:sz w:val="20"/>
-          <w:szCs w:val="20"/>
-        </w:rPr>
-      </w:pPr>
-      <w:r>
-        <w:rPr>
-          <w:sz w:val="20"/>
-          <w:szCs w:val="20"/>
-        </w:rPr>
-        <w:t>| GET | /</w:t>
-      </w:r>
-      <w:proofErr w:type="spellStart"/>
-      <w:r>
-        <w:rPr>
-          <w:sz w:val="20"/>
-          <w:szCs w:val="20"/>
-        </w:rPr>
-        <w:t>api</w:t>
-      </w:r>
-      <w:proofErr w:type="spellEnd"/>
-      <w:r>
-        <w:rPr>
-          <w:sz w:val="20"/>
-          <w:szCs w:val="20"/>
-        </w:rPr>
-        <w:t>/meals/search/</w:t>
-      </w:r>
-      <w:proofErr w:type="spellStart"/>
-      <w:r>
-        <w:rPr>
-          <w:sz w:val="20"/>
-          <w:szCs w:val="20"/>
-        </w:rPr>
-        <w:t>minprotein</w:t>
-      </w:r>
-      <w:proofErr w:type="spellEnd"/>
-      <w:r>
-        <w:rPr>
-          <w:sz w:val="20"/>
-          <w:szCs w:val="20"/>
-        </w:rPr>
-        <w:t>/{</w:t>
-      </w:r>
-      <w:proofErr w:type="spellStart"/>
-      <w:r>
-        <w:rPr>
-          <w:sz w:val="20"/>
-          <w:szCs w:val="20"/>
-        </w:rPr>
-        <w:t>minProtein</w:t>
-      </w:r>
-      <w:proofErr w:type="spellEnd"/>
-      <w:r>
-        <w:rPr>
-          <w:sz w:val="20"/>
-          <w:szCs w:val="20"/>
-        </w:rPr>
-        <w:t>} | Filter by minimum protein |</w:t>
-      </w:r>
-    </w:p>
-    <w:p>
-      <w:pPr>
-        <w:spacing w:after="0"/>
-        <w:rPr>
-          <w:sz w:val="20"/>
-          <w:szCs w:val="20"/>
-        </w:rPr>
-      </w:pPr>
-      <w:r>
-        <w:rPr>
-          <w:sz w:val="20"/>
-          <w:szCs w:val="20"/>
-        </w:rPr>
-        <w:t>| GET | /</w:t>
-      </w:r>
-      <w:proofErr w:type="spellStart"/>
-      <w:r>
-        <w:rPr>
-          <w:sz w:val="20"/>
-          <w:szCs w:val="20"/>
-        </w:rPr>
-        <w:t>api</w:t>
-      </w:r>
-      <w:proofErr w:type="spellEnd"/>
-      <w:r>
-        <w:rPr>
-          <w:sz w:val="20"/>
-          <w:szCs w:val="20"/>
-        </w:rPr>
-        <w:t>/meals/search/</w:t>
-      </w:r>
-      <w:proofErr w:type="spellStart"/>
-      <w:r>
-        <w:rPr>
-          <w:sz w:val="20"/>
-          <w:szCs w:val="20"/>
-        </w:rPr>
-        <w:t>totalFat</w:t>
-      </w:r>
-      <w:proofErr w:type="spellEnd"/>
-      <w:r>
-        <w:rPr>
-          <w:sz w:val="20"/>
-          <w:szCs w:val="20"/>
-        </w:rPr>
-        <w:t>/{</w:t>
-      </w:r>
-      <w:proofErr w:type="spellStart"/>
-      <w:r>
-        <w:rPr>
-          <w:sz w:val="20"/>
-          <w:szCs w:val="20"/>
-        </w:rPr>
-        <w:t>totalFat</w:t>
-      </w:r>
-      <w:proofErr w:type="spellEnd"/>
-      <w:r>
-        <w:rPr>
-          <w:sz w:val="20"/>
-          <w:szCs w:val="20"/>
-        </w:rPr>
-        <w:t>} | Filter by total fat |</w:t>
-      </w:r>
-    </w:p>
-    <w:p>
-      <w:pPr>
-        <w:spacing w:after="0"/>
-        <w:rPr>
-          <w:sz w:val="20"/>
-          <w:szCs w:val="20"/>
-        </w:rPr>
-      </w:pPr>
-      <w:r>
-        <w:rPr>
-          <w:sz w:val="20"/>
-          <w:szCs w:val="20"/>
-        </w:rPr>
-        <w:t>| GET | /</w:t>
-      </w:r>
-      <w:proofErr w:type="spellStart"/>
-      <w:r>
-        <w:rPr>
-          <w:sz w:val="20"/>
-          <w:szCs w:val="20"/>
-        </w:rPr>
-        <w:t>api</w:t>
-      </w:r>
-      <w:proofErr w:type="spellEnd"/>
-      <w:r>
-        <w:rPr>
-          <w:sz w:val="20"/>
-          <w:szCs w:val="20"/>
-        </w:rPr>
-        <w:t>/meals/search/</w:t>
-      </w:r>
-      <w:proofErr w:type="spellStart"/>
-      <w:r>
-        <w:rPr>
-          <w:sz w:val="20"/>
-          <w:szCs w:val="20"/>
-        </w:rPr>
-        <w:t>prepTime</w:t>
-      </w:r>
-      <w:proofErr w:type="spellEnd"/>
-      <w:r>
-        <w:rPr>
-          <w:sz w:val="20"/>
-          <w:szCs w:val="20"/>
-        </w:rPr>
-        <w:t>/{</w:t>
-      </w:r>
-      <w:proofErr w:type="spellStart"/>
-      <w:r>
-        <w:rPr>
-          <w:sz w:val="20"/>
-          <w:szCs w:val="20"/>
-        </w:rPr>
-        <w:t>prepTime</w:t>
-      </w:r>
-      <w:proofErr w:type="spellEnd"/>
-      <w:r>
-        <w:rPr>
-          <w:sz w:val="20"/>
-          <w:szCs w:val="20"/>
-        </w:rPr>
-        <w:t>} | Filter by prep time |</w:t>
-      </w:r>
-    </w:p>
-    <w:p>
-      <w:pPr>
-        <w:spacing w:after="0"/>
-        <w:rPr>
-          <w:sz w:val="20"/>
-          <w:szCs w:val="20"/>
-        </w:rPr>
-      </w:pPr>
-      <w:r>
-        <w:rPr>
-          <w:sz w:val="20"/>
-          <w:szCs w:val="20"/>
-        </w:rPr>
-        <w:t>| GET | /</w:t>
-      </w:r>
-      <w:proofErr w:type="spellStart"/>
-      <w:r>
-        <w:rPr>
-          <w:sz w:val="20"/>
-          <w:szCs w:val="20"/>
-        </w:rPr>
-        <w:t>api</w:t>
-      </w:r>
-      <w:proofErr w:type="spellEnd"/>
-      <w:r>
-        <w:rPr>
-          <w:sz w:val="20"/>
-          <w:szCs w:val="20"/>
-        </w:rPr>
-        <w:t>/meals/search/</w:t>
-      </w:r>
-      <w:proofErr w:type="spellStart"/>
-      <w:r>
-        <w:rPr>
-          <w:sz w:val="20"/>
-          <w:szCs w:val="20"/>
-        </w:rPr>
-        <w:t>cookTime</w:t>
-      </w:r>
-      <w:proofErr w:type="spellEnd"/>
-      <w:r>
-        <w:rPr>
-          <w:sz w:val="20"/>
-          <w:szCs w:val="20"/>
-        </w:rPr>
-        <w:t>/{</w:t>
-      </w:r>
-      <w:proofErr w:type="spellStart"/>
-      <w:r>
-        <w:rPr>
-          <w:sz w:val="20"/>
-          <w:szCs w:val="20"/>
-        </w:rPr>
-        <w:t>cookTime</w:t>
-      </w:r>
-      <w:proofErr w:type="spellEnd"/>
-      <w:r>
-        <w:rPr>
-          <w:sz w:val="20"/>
-          <w:szCs w:val="20"/>
-        </w:rPr>
-        <w:t>} | Filter by cook time |</w:t>
-      </w:r>
-    </w:p>
-    <w:p>
-      <w:pPr>
-        <w:spacing w:after="0"/>
-        <w:rPr>
-          <w:sz w:val="20"/>
-          <w:szCs w:val="20"/>
-        </w:rPr>
-      </w:pPr>
-      <w:r>
-        <w:rPr>
-          <w:sz w:val="20"/>
-          <w:szCs w:val="20"/>
-        </w:rPr>
-        <w:t>| GET | /</w:t>
-      </w:r>
-      <w:proofErr w:type="spellStart"/>
-      <w:r>
-        <w:rPr>
-          <w:sz w:val="20"/>
-          <w:szCs w:val="20"/>
-        </w:rPr>
-        <w:t>api</w:t>
-      </w:r>
-      <w:proofErr w:type="spellEnd"/>
-      <w:r>
-        <w:rPr>
-          <w:sz w:val="20"/>
-          <w:szCs w:val="20"/>
-        </w:rPr>
-        <w:t>/meals/search/servings/{servings} | Filter by servings |</w:t>
-      </w:r>
-    </w:p>
-    <w:p>
-      <w:pPr>
-        <w:spacing w:after="0"/>
-        <w:rPr>
-          <w:sz w:val="20"/>
-          <w:szCs w:val="20"/>
-        </w:rPr>
-      </w:pPr>
-      <w:r>
-        <w:rPr>
-          <w:sz w:val="20"/>
-          <w:szCs w:val="20"/>
-        </w:rPr>
-        <w:t>| POST | /</w:t>
-      </w:r>
-      <w:proofErr w:type="spellStart"/>
-      <w:r>
-        <w:rPr>
-          <w:sz w:val="20"/>
-          <w:szCs w:val="20"/>
-        </w:rPr>
-        <w:t>api</w:t>
-      </w:r>
-      <w:proofErr w:type="spellEnd"/>
-      <w:r>
-        <w:rPr>
-          <w:sz w:val="20"/>
-          <w:szCs w:val="20"/>
-        </w:rPr>
-        <w:t>/meals | Create a new meal |</w:t>
-      </w:r>
-    </w:p>
-    <w:p>
-      <w:pPr>
-        <w:spacing w:after="0"/>
-        <w:rPr>
-          <w:sz w:val="20"/>
-          <w:szCs w:val="20"/>
-        </w:rPr>
-      </w:pPr>
-      <w:r>
-        <w:rPr>
-          <w:sz w:val="20"/>
-          <w:szCs w:val="20"/>
-        </w:rPr>
-        <w:t>| PUT | /</w:t>
-      </w:r>
-      <w:proofErr w:type="spellStart"/>
-      <w:r>
-        <w:rPr>
-          <w:sz w:val="20"/>
-          <w:szCs w:val="20"/>
-        </w:rPr>
-        <w:t>api</w:t>
-      </w:r>
-      <w:proofErr w:type="spellEnd"/>
-      <w:r>
-        <w:rPr>
-          <w:sz w:val="20"/>
-          <w:szCs w:val="20"/>
-        </w:rPr>
-        <w:t>/meals/{id} | Update a meal |</w:t>
+        <w:t>| GET | /api/meals | Get all meals |</w:t>
+      </w:r>
+    </w:p>
+    <w:p>
+      <w:pPr>
+        <w:spacing w:after="0"/>
+        <w:rPr>
+          <w:sz w:val="20"/>
+          <w:szCs w:val="20"/>
+        </w:rPr>
+      </w:pPr>
+      <w:r>
+        <w:rPr>
+          <w:sz w:val="20"/>
+          <w:szCs w:val="20"/>
+        </w:rPr>
+        <w:t>| GET | /api/meals/{id} | Get meal by ID |</w:t>
+      </w:r>
+    </w:p>
+    <w:p>
+      <w:pPr>
+        <w:spacing w:after="0"/>
+        <w:rPr>
+          <w:sz w:val="20"/>
+          <w:szCs w:val="20"/>
+        </w:rPr>
+      </w:pPr>
+      <w:r>
+        <w:rPr>
+          <w:sz w:val="20"/>
+          <w:szCs w:val="20"/>
+        </w:rPr>
+        <w:t>| GET | /api/meals/search/name/{name} | Search meals by name |</w:t>
+      </w:r>
+    </w:p>
+    <w:p>
+      <w:pPr>
+        <w:spacing w:after="0"/>
+        <w:rPr>
+          <w:sz w:val="20"/>
+          <w:szCs w:val="20"/>
+        </w:rPr>
+      </w:pPr>
+      <w:r>
+        <w:rPr>
+          <w:sz w:val="20"/>
+          <w:szCs w:val="20"/>
+        </w:rPr>
+        <w:t>| GET | /api/meals/search/category/{category} | Filter by category |</w:t>
+      </w:r>
+    </w:p>
+    <w:p>
+      <w:pPr>
+        <w:spacing w:after="0"/>
+        <w:rPr>
+          <w:sz w:val="20"/>
+          <w:szCs w:val="20"/>
+        </w:rPr>
+      </w:pPr>
+      <w:r>
+        <w:rPr>
+          <w:sz w:val="20"/>
+          <w:szCs w:val="20"/>
+        </w:rPr>
+        <w:t>| GET | /api/meals/search/difficulty/{difficulty} | Filter by difficulty |</w:t>
+      </w:r>
+    </w:p>
+    <w:p>
+      <w:pPr>
+        <w:spacing w:after="0"/>
+        <w:rPr>
+          <w:sz w:val="20"/>
+          <w:szCs w:val="20"/>
+        </w:rPr>
+      </w:pPr>
+      <w:r>
+        <w:rPr>
+          <w:sz w:val="20"/>
+          <w:szCs w:val="20"/>
+        </w:rPr>
+        <w:t>| GET | /api/meals/search/rating/{rating} | Filter by rating |</w:t>
+      </w:r>
+    </w:p>
+    <w:p>
+      <w:pPr>
+        <w:spacing w:after="0"/>
+        <w:rPr>
+          <w:sz w:val="20"/>
+          <w:szCs w:val="20"/>
+        </w:rPr>
+      </w:pPr>
+      <w:r>
+        <w:rPr>
+          <w:sz w:val="20"/>
+          <w:szCs w:val="20"/>
+        </w:rPr>
+        <w:t>| GET | /api/meals/search/calories/{calories} | Filter by calories |</w:t>
+      </w:r>
+    </w:p>
+    <w:p>
+      <w:pPr>
+        <w:spacing w:after="0"/>
+        <w:rPr>
+          <w:sz w:val="20"/>
+          <w:szCs w:val="20"/>
+        </w:rPr>
+      </w:pPr>
+      <w:r>
+        <w:rPr>
+          <w:sz w:val="20"/>
+          <w:szCs w:val="20"/>
+        </w:rPr>
+        <w:t>| GET | /api/meals/search/protein/{protein} | Filter by protein |</w:t>
+      </w:r>
+    </w:p>
+    <w:p>
+      <w:pPr>
+        <w:spacing w:after="0"/>
+        <w:rPr>
+          <w:sz w:val="20"/>
+          <w:szCs w:val="20"/>
+        </w:rPr>
+      </w:pPr>
+      <w:r>
+        <w:rPr>
+          <w:sz w:val="20"/>
+          <w:szCs w:val="20"/>
+        </w:rPr>
+        <w:t>| GET | /api/meals/search/minprotein/{minProtein} | Filter by minimum protein |</w:t>
+      </w:r>
+    </w:p>
+    <w:p>
+      <w:pPr>
+        <w:spacing w:after="0"/>
+        <w:rPr>
+          <w:sz w:val="20"/>
+          <w:szCs w:val="20"/>
+        </w:rPr>
+      </w:pPr>
+      <w:r>
+        <w:rPr>
+          <w:sz w:val="20"/>
+          <w:szCs w:val="20"/>
+        </w:rPr>
+        <w:t>| GET | /api/meals/search/totalFat/{totalFat} | Filter by total fat |</w:t>
+      </w:r>
+    </w:p>
+    <w:p>
+      <w:pPr>
+        <w:spacing w:after="0"/>
+        <w:rPr>
+          <w:sz w:val="20"/>
+          <w:szCs w:val="20"/>
+        </w:rPr>
+      </w:pPr>
+      <w:r>
+        <w:rPr>
+          <w:sz w:val="20"/>
+          <w:szCs w:val="20"/>
+        </w:rPr>
+        <w:t>| GET | /api/meals/search/prepTime/{prepTime} | Filter by prep time |</w:t>
+      </w:r>
+    </w:p>
+    <w:p>
+      <w:pPr>
+        <w:spacing w:after="0"/>
+        <w:rPr>
+          <w:sz w:val="20"/>
+          <w:szCs w:val="20"/>
+        </w:rPr>
+      </w:pPr>
+      <w:r>
+        <w:rPr>
+          <w:sz w:val="20"/>
+          <w:szCs w:val="20"/>
+        </w:rPr>
+        <w:t>| GET | /api/meals/search/cookTime/{cookTime} | Filter by cook time |</w:t>
+      </w:r>
+    </w:p>
+    <w:p>
+      <w:pPr>
+        <w:spacing w:after="0"/>
+        <w:rPr>
+          <w:sz w:val="20"/>
+          <w:szCs w:val="20"/>
+        </w:rPr>
+      </w:pPr>
+      <w:r>
+        <w:rPr>
+          <w:sz w:val="20"/>
+          <w:szCs w:val="20"/>
+        </w:rPr>
+        <w:t>| GET | /api/meals/search/servings/{servings} | Filter by servings |</w:t>
+      </w:r>
+    </w:p>
+    <w:p>
+      <w:pPr>
+        <w:spacing w:after="0"/>
+        <w:rPr>
+          <w:sz w:val="20"/>
+          <w:szCs w:val="20"/>
+        </w:rPr>
+      </w:pPr>
+      <w:r>
+        <w:rPr>
+          <w:sz w:val="20"/>
+          <w:szCs w:val="20"/>
+        </w:rPr>
+        <w:t>| POST | /api/meals | Create a new meal |</w:t>
+      </w:r>
+    </w:p>
+    <w:p>
+      <w:pPr>
+        <w:spacing w:after="0"/>
+        <w:rPr>
+          <w:sz w:val="20"/>
+          <w:szCs w:val="20"/>
+        </w:rPr>
+      </w:pPr>
+      <w:r>
+        <w:rPr>
+          <w:sz w:val="20"/>
+          <w:szCs w:val="20"/>
+        </w:rPr>
+        <w:t>| PUT | /api/meals/{id} | Update a meal |</w:t>
       </w:r>
     </w:p>
     <w:p>
@@ -2057,23 +1501,7 @@
           <w:sz w:val="20"/>
           <w:szCs w:val="20"/>
         </w:rPr>
-        <w:t>| DELETE | /</w:t>
-      </w:r>
-      <w:proofErr w:type="spellStart"/>
-      <w:r>
-        <w:rPr>
-          <w:sz w:val="20"/>
-          <w:szCs w:val="20"/>
-        </w:rPr>
-        <w:t>api</w:t>
-      </w:r>
-      <w:proofErr w:type="spellEnd"/>
-      <w:r>
-        <w:rPr>
-          <w:sz w:val="20"/>
-          <w:szCs w:val="20"/>
-        </w:rPr>
-        <w:t>/meals/{id} | Delete a meal |</w:t>
+        <w:t>| DELETE | /api/meals/{id} | Delete a meal |</w:t>
       </w:r>
     </w:p>
     <w:p>
@@ -2116,311 +1544,119 @@
           <w:sz w:val="20"/>
           <w:szCs w:val="20"/>
         </w:rPr>
-        <w:t>| GET | /</w:t>
-      </w:r>
-      <w:proofErr w:type="spellStart"/>
-      <w:r>
-        <w:rPr>
-          <w:sz w:val="20"/>
-          <w:szCs w:val="20"/>
-        </w:rPr>
-        <w:t>api</w:t>
-      </w:r>
-      <w:proofErr w:type="spellEnd"/>
-      <w:r>
-        <w:rPr>
-          <w:sz w:val="20"/>
-          <w:szCs w:val="20"/>
-        </w:rPr>
-        <w:t>/plans | Get all plans |</w:t>
-      </w:r>
-    </w:p>
-    <w:p>
-      <w:pPr>
-        <w:spacing w:after="0"/>
-        <w:rPr>
-          <w:sz w:val="20"/>
-          <w:szCs w:val="20"/>
-        </w:rPr>
-      </w:pPr>
-      <w:r>
-        <w:rPr>
-          <w:sz w:val="20"/>
-          <w:szCs w:val="20"/>
-        </w:rPr>
-        <w:t>| GET | /</w:t>
-      </w:r>
-      <w:proofErr w:type="spellStart"/>
-      <w:r>
-        <w:rPr>
-          <w:sz w:val="20"/>
-          <w:szCs w:val="20"/>
-        </w:rPr>
-        <w:t>api</w:t>
-      </w:r>
-      <w:proofErr w:type="spellEnd"/>
-      <w:r>
-        <w:rPr>
-          <w:sz w:val="20"/>
-          <w:szCs w:val="20"/>
-        </w:rPr>
-        <w:t>/plans/{id} | Get plan by ID |</w:t>
-      </w:r>
-    </w:p>
-    <w:p>
-      <w:pPr>
-        <w:spacing w:after="0"/>
-        <w:rPr>
-          <w:sz w:val="20"/>
-          <w:szCs w:val="20"/>
-        </w:rPr>
-      </w:pPr>
-      <w:r>
-        <w:rPr>
-          <w:sz w:val="20"/>
-          <w:szCs w:val="20"/>
-        </w:rPr>
-        <w:t>| GET | /</w:t>
-      </w:r>
-      <w:proofErr w:type="spellStart"/>
-      <w:r>
-        <w:rPr>
-          <w:sz w:val="20"/>
-          <w:szCs w:val="20"/>
-        </w:rPr>
-        <w:t>api</w:t>
-      </w:r>
-      <w:proofErr w:type="spellEnd"/>
-      <w:r>
-        <w:rPr>
-          <w:sz w:val="20"/>
-          <w:szCs w:val="20"/>
-        </w:rPr>
-        <w:t>/plans/{id}/meals | Get all meals in a plan |</w:t>
-      </w:r>
-    </w:p>
-    <w:p>
-      <w:pPr>
-        <w:spacing w:after="0"/>
-        <w:rPr>
-          <w:sz w:val="20"/>
-          <w:szCs w:val="20"/>
-        </w:rPr>
-      </w:pPr>
-      <w:r>
-        <w:rPr>
-          <w:sz w:val="20"/>
-          <w:szCs w:val="20"/>
-        </w:rPr>
-        <w:t>| POST | /</w:t>
-      </w:r>
-      <w:proofErr w:type="spellStart"/>
-      <w:r>
-        <w:rPr>
-          <w:sz w:val="20"/>
-          <w:szCs w:val="20"/>
-        </w:rPr>
-        <w:t>api</w:t>
-      </w:r>
-      <w:proofErr w:type="spellEnd"/>
-      <w:r>
-        <w:rPr>
-          <w:sz w:val="20"/>
-          <w:szCs w:val="20"/>
-        </w:rPr>
-        <w:t>/plans | Create a new plan |</w:t>
-      </w:r>
-    </w:p>
-    <w:p>
-      <w:pPr>
-        <w:spacing w:after="0"/>
-        <w:rPr>
-          <w:sz w:val="20"/>
-          <w:szCs w:val="20"/>
-        </w:rPr>
-      </w:pPr>
-      <w:r>
-        <w:rPr>
-          <w:sz w:val="20"/>
-          <w:szCs w:val="20"/>
-        </w:rPr>
-        <w:t>| PUT | /</w:t>
-      </w:r>
-      <w:proofErr w:type="spellStart"/>
-      <w:r>
-        <w:rPr>
-          <w:sz w:val="20"/>
-          <w:szCs w:val="20"/>
-        </w:rPr>
-        <w:t>api</w:t>
-      </w:r>
-      <w:proofErr w:type="spellEnd"/>
-      <w:r>
-        <w:rPr>
-          <w:sz w:val="20"/>
-          <w:szCs w:val="20"/>
-        </w:rPr>
-        <w:t>/plans/{id} | Update a plan |</w:t>
-      </w:r>
-    </w:p>
-    <w:p>
-      <w:pPr>
-        <w:spacing w:after="0"/>
-        <w:rPr>
-          <w:sz w:val="20"/>
-          <w:szCs w:val="20"/>
-        </w:rPr>
-      </w:pPr>
-      <w:r>
-        <w:rPr>
-          <w:sz w:val="20"/>
-          <w:szCs w:val="20"/>
-        </w:rPr>
-        <w:t>| DELETE | /</w:t>
-      </w:r>
-      <w:proofErr w:type="spellStart"/>
-      <w:r>
-        <w:rPr>
-          <w:sz w:val="20"/>
-          <w:szCs w:val="20"/>
-        </w:rPr>
-        <w:t>api</w:t>
-      </w:r>
-      <w:proofErr w:type="spellEnd"/>
-      <w:r>
-        <w:rPr>
-          <w:sz w:val="20"/>
-          <w:szCs w:val="20"/>
-        </w:rPr>
-        <w:t>/plans/{id} | Delete a plan |</w:t>
-      </w:r>
-    </w:p>
-    <w:p>
-      <w:pPr>
-        <w:spacing w:after="0"/>
-        <w:rPr>
-          <w:sz w:val="20"/>
-          <w:szCs w:val="20"/>
-        </w:rPr>
-      </w:pPr>
-      <w:r>
-        <w:rPr>
-          <w:sz w:val="20"/>
-          <w:szCs w:val="20"/>
-        </w:rPr>
-        <w:t>| POST | /</w:t>
-      </w:r>
-      <w:proofErr w:type="spellStart"/>
-      <w:r>
-        <w:rPr>
-          <w:sz w:val="20"/>
-          <w:szCs w:val="20"/>
-        </w:rPr>
-        <w:t>api</w:t>
-      </w:r>
-      <w:proofErr w:type="spellEnd"/>
-      <w:r>
-        <w:rPr>
-          <w:sz w:val="20"/>
-          <w:szCs w:val="20"/>
-        </w:rPr>
-        <w:t>/plans/{</w:t>
-      </w:r>
-      <w:proofErr w:type="spellStart"/>
-      <w:r>
-        <w:rPr>
-          <w:sz w:val="20"/>
-          <w:szCs w:val="20"/>
-        </w:rPr>
-        <w:t>planId</w:t>
-      </w:r>
-      <w:proofErr w:type="spellEnd"/>
-      <w:r>
-        <w:rPr>
-          <w:sz w:val="20"/>
-          <w:szCs w:val="20"/>
-        </w:rPr>
-        <w:t>}/meals/{</w:t>
-      </w:r>
-      <w:proofErr w:type="spellStart"/>
-      <w:r>
-        <w:rPr>
-          <w:sz w:val="20"/>
-          <w:szCs w:val="20"/>
-        </w:rPr>
-        <w:t>mealId</w:t>
-      </w:r>
-      <w:proofErr w:type="spellEnd"/>
-      <w:r>
-        <w:rPr>
-          <w:sz w:val="20"/>
-          <w:szCs w:val="20"/>
-        </w:rPr>
-        <w:t>} | Assign a meal to a plan |</w:t>
-      </w:r>
-    </w:p>
-    <w:p>
-      <w:pPr>
-        <w:spacing w:after="0"/>
-        <w:rPr>
-          <w:sz w:val="20"/>
-          <w:szCs w:val="20"/>
-        </w:rPr>
-      </w:pPr>
-      <w:r>
-        <w:rPr>
-          <w:sz w:val="20"/>
-          <w:szCs w:val="20"/>
-        </w:rPr>
-        <w:t>| DELETE | /</w:t>
-      </w:r>
-      <w:proofErr w:type="spellStart"/>
-      <w:r>
-        <w:rPr>
-          <w:sz w:val="20"/>
-          <w:szCs w:val="20"/>
-        </w:rPr>
-        <w:t>api</w:t>
-      </w:r>
-      <w:proofErr w:type="spellEnd"/>
-      <w:r>
-        <w:rPr>
-          <w:sz w:val="20"/>
-          <w:szCs w:val="20"/>
-        </w:rPr>
-        <w:t>/plans/{</w:t>
-      </w:r>
-      <w:proofErr w:type="spellStart"/>
-      <w:r>
-        <w:rPr>
-          <w:sz w:val="20"/>
-          <w:szCs w:val="20"/>
-        </w:rPr>
-        <w:t>planId</w:t>
-      </w:r>
-      <w:proofErr w:type="spellEnd"/>
-      <w:r>
-        <w:rPr>
-          <w:sz w:val="20"/>
-          <w:szCs w:val="20"/>
-        </w:rPr>
-        <w:t>}/meals/{</w:t>
-      </w:r>
-      <w:proofErr w:type="spellStart"/>
-      <w:r>
-        <w:rPr>
-          <w:sz w:val="20"/>
-          <w:szCs w:val="20"/>
-        </w:rPr>
-        <w:t>mealId</w:t>
-      </w:r>
-      <w:proofErr w:type="spellEnd"/>
-      <w:r>
-        <w:rPr>
-          <w:sz w:val="20"/>
-          <w:szCs w:val="20"/>
-        </w:rPr>
-        <w:t>} | Remove a meal from a plan |</w:t>
+        <w:t>| GET | /api/plans | Get all plans |</w:t>
+      </w:r>
+    </w:p>
+    <w:p>
+      <w:pPr>
+        <w:spacing w:after="0"/>
+        <w:rPr>
+          <w:sz w:val="20"/>
+          <w:szCs w:val="20"/>
+        </w:rPr>
+      </w:pPr>
+      <w:r>
+        <w:rPr>
+          <w:sz w:val="20"/>
+          <w:szCs w:val="20"/>
+        </w:rPr>
+        <w:t>| GET | /api/plans/{id} | Get plan by ID |</w:t>
+      </w:r>
+    </w:p>
+    <w:p>
+      <w:pPr>
+        <w:spacing w:after="0"/>
+        <w:rPr>
+          <w:sz w:val="20"/>
+          <w:szCs w:val="20"/>
+        </w:rPr>
+      </w:pPr>
+      <w:r>
+        <w:rPr>
+          <w:sz w:val="20"/>
+          <w:szCs w:val="20"/>
+        </w:rPr>
+        <w:t>| GET | /api/plans/{id}/meals | Get all meals in a plan |</w:t>
+      </w:r>
+    </w:p>
+    <w:p>
+      <w:pPr>
+        <w:spacing w:after="0"/>
+        <w:rPr>
+          <w:sz w:val="20"/>
+          <w:szCs w:val="20"/>
+        </w:rPr>
+      </w:pPr>
+      <w:r>
+        <w:rPr>
+          <w:sz w:val="20"/>
+          <w:szCs w:val="20"/>
+        </w:rPr>
+        <w:t>| POST | /api/plans | Create a new plan |</w:t>
+      </w:r>
+    </w:p>
+    <w:p>
+      <w:pPr>
+        <w:spacing w:after="0"/>
+        <w:rPr>
+          <w:sz w:val="20"/>
+          <w:szCs w:val="20"/>
+        </w:rPr>
+      </w:pPr>
+      <w:r>
+        <w:rPr>
+          <w:sz w:val="20"/>
+          <w:szCs w:val="20"/>
+        </w:rPr>
+        <w:t>| PUT | /api/plans/{id} | Update a plan |</w:t>
+      </w:r>
+    </w:p>
+    <w:p>
+      <w:pPr>
+        <w:spacing w:after="0"/>
+        <w:rPr>
+          <w:sz w:val="20"/>
+          <w:szCs w:val="20"/>
+        </w:rPr>
+      </w:pPr>
+      <w:r>
+        <w:rPr>
+          <w:sz w:val="20"/>
+          <w:szCs w:val="20"/>
+        </w:rPr>
+        <w:t>| DELETE | /api/plans/{id} | Delete a plan |</w:t>
+      </w:r>
+    </w:p>
+    <w:p>
+      <w:pPr>
+        <w:spacing w:after="0"/>
+        <w:rPr>
+          <w:sz w:val="20"/>
+          <w:szCs w:val="20"/>
+        </w:rPr>
+      </w:pPr>
+      <w:r>
+        <w:rPr>
+          <w:sz w:val="20"/>
+          <w:szCs w:val="20"/>
+        </w:rPr>
+        <w:t>| POST | /api/plans/{planId}/meals/{mealId} | Assign a meal to a plan |</w:t>
+      </w:r>
+    </w:p>
+    <w:p>
+      <w:pPr>
+        <w:spacing w:after="0"/>
+        <w:rPr>
+          <w:sz w:val="20"/>
+          <w:szCs w:val="20"/>
+        </w:rPr>
+      </w:pPr>
+      <w:r>
+        <w:rPr>
+          <w:sz w:val="20"/>
+          <w:szCs w:val="20"/>
+        </w:rPr>
+        <w:t>| DELETE | /api/plans/{planId}/meals/{mealId} | Remove a meal from a plan |</w:t>
       </w:r>
     </w:p>
     <w:p>
@@ -2472,215 +1708,55 @@
           <w:sz w:val="20"/>
           <w:szCs w:val="20"/>
         </w:rPr>
-        <w:t>| GET | /</w:t>
-      </w:r>
-      <w:proofErr w:type="spellStart"/>
-      <w:r>
-        <w:rPr>
-          <w:sz w:val="20"/>
-          <w:szCs w:val="20"/>
-        </w:rPr>
-        <w:t>api</w:t>
-      </w:r>
-      <w:proofErr w:type="spellEnd"/>
-      <w:r>
-        <w:rPr>
-          <w:sz w:val="20"/>
-          <w:szCs w:val="20"/>
-        </w:rPr>
-        <w:t>/ingredients | Get all ingredients |</w:t>
-      </w:r>
-    </w:p>
-    <w:p>
-      <w:pPr>
-        <w:spacing w:after="0"/>
-        <w:rPr>
-          <w:sz w:val="20"/>
-          <w:szCs w:val="20"/>
-        </w:rPr>
-      </w:pPr>
-      <w:r>
-        <w:rPr>
-          <w:sz w:val="20"/>
-          <w:szCs w:val="20"/>
-        </w:rPr>
-        <w:t>| GET | /</w:t>
-      </w:r>
-      <w:proofErr w:type="spellStart"/>
-      <w:r>
-        <w:rPr>
-          <w:sz w:val="20"/>
-          <w:szCs w:val="20"/>
-        </w:rPr>
-        <w:t>api</w:t>
-      </w:r>
-      <w:proofErr w:type="spellEnd"/>
-      <w:r>
-        <w:rPr>
-          <w:sz w:val="20"/>
-          <w:szCs w:val="20"/>
-        </w:rPr>
-        <w:t>/ingredients/{id} | Get ingredient by ID |</w:t>
-      </w:r>
-    </w:p>
-    <w:p>
-      <w:pPr>
-        <w:spacing w:after="0"/>
-        <w:rPr>
-          <w:sz w:val="20"/>
-          <w:szCs w:val="20"/>
-        </w:rPr>
-      </w:pPr>
-      <w:r>
-        <w:rPr>
-          <w:sz w:val="20"/>
-          <w:szCs w:val="20"/>
-        </w:rPr>
-        <w:t>| GET | /</w:t>
-      </w:r>
-      <w:proofErr w:type="spellStart"/>
-      <w:r>
-        <w:rPr>
-          <w:sz w:val="20"/>
-          <w:szCs w:val="20"/>
-        </w:rPr>
-        <w:t>api</w:t>
-      </w:r>
-      <w:proofErr w:type="spellEnd"/>
-      <w:r>
-        <w:rPr>
-          <w:sz w:val="20"/>
-          <w:szCs w:val="20"/>
-        </w:rPr>
-        <w:t xml:space="preserve">/ingredients/search | Search with query params: name, origin, </w:t>
-      </w:r>
-      <w:proofErr w:type="spellStart"/>
-      <w:r>
-        <w:rPr>
-          <w:sz w:val="20"/>
-          <w:szCs w:val="20"/>
-        </w:rPr>
-        <w:t>minPrice</w:t>
-      </w:r>
-      <w:proofErr w:type="spellEnd"/>
-      <w:r>
-        <w:rPr>
-          <w:sz w:val="20"/>
-          <w:szCs w:val="20"/>
-        </w:rPr>
-        <w:t xml:space="preserve">, </w:t>
-      </w:r>
-      <w:proofErr w:type="spellStart"/>
-      <w:r>
-        <w:rPr>
-          <w:sz w:val="20"/>
-          <w:szCs w:val="20"/>
-        </w:rPr>
-        <w:t>maxPrice</w:t>
-      </w:r>
-      <w:proofErr w:type="spellEnd"/>
-      <w:r>
-        <w:rPr>
-          <w:sz w:val="20"/>
-          <w:szCs w:val="20"/>
-        </w:rPr>
-        <w:t xml:space="preserve">, </w:t>
-      </w:r>
-      <w:proofErr w:type="spellStart"/>
-      <w:r>
-        <w:rPr>
-          <w:sz w:val="20"/>
-          <w:szCs w:val="20"/>
-        </w:rPr>
-        <w:t>minProtein</w:t>
-      </w:r>
-      <w:proofErr w:type="spellEnd"/>
-      <w:r>
-        <w:rPr>
-          <w:sz w:val="20"/>
-          <w:szCs w:val="20"/>
-        </w:rPr>
-        <w:t xml:space="preserve">, </w:t>
-      </w:r>
-      <w:proofErr w:type="spellStart"/>
-      <w:r>
-        <w:rPr>
-          <w:sz w:val="20"/>
-          <w:szCs w:val="20"/>
-        </w:rPr>
-        <w:t>maxProtein</w:t>
-      </w:r>
-      <w:proofErr w:type="spellEnd"/>
-      <w:r>
-        <w:rPr>
-          <w:sz w:val="20"/>
-          <w:szCs w:val="20"/>
-        </w:rPr>
-        <w:t xml:space="preserve">, </w:t>
-      </w:r>
-      <w:proofErr w:type="spellStart"/>
-      <w:r>
-        <w:rPr>
-          <w:sz w:val="20"/>
-          <w:szCs w:val="20"/>
-        </w:rPr>
-        <w:t>minFats</w:t>
-      </w:r>
-      <w:proofErr w:type="spellEnd"/>
-      <w:r>
-        <w:rPr>
-          <w:sz w:val="20"/>
-          <w:szCs w:val="20"/>
-        </w:rPr>
-        <w:t xml:space="preserve">, </w:t>
-      </w:r>
-      <w:proofErr w:type="spellStart"/>
-      <w:r>
-        <w:rPr>
-          <w:sz w:val="20"/>
-          <w:szCs w:val="20"/>
-        </w:rPr>
-        <w:t>maxFats</w:t>
-      </w:r>
-      <w:proofErr w:type="spellEnd"/>
-      <w:r>
-        <w:rPr>
-          <w:sz w:val="20"/>
-          <w:szCs w:val="20"/>
-        </w:rPr>
-        <w:t xml:space="preserve"> |</w:t>
-      </w:r>
-    </w:p>
-    <w:p>
-      <w:pPr>
-        <w:spacing w:after="0"/>
-        <w:rPr>
-          <w:sz w:val="20"/>
-          <w:szCs w:val="20"/>
-        </w:rPr>
-      </w:pPr>
-      <w:r>
-        <w:rPr>
-          <w:sz w:val="20"/>
-          <w:szCs w:val="20"/>
-        </w:rPr>
-        <w:t>| GET | /</w:t>
-      </w:r>
-      <w:proofErr w:type="spellStart"/>
-      <w:r>
-        <w:rPr>
-          <w:sz w:val="20"/>
-          <w:szCs w:val="20"/>
-        </w:rPr>
-        <w:t>api</w:t>
-      </w:r>
-      <w:proofErr w:type="spellEnd"/>
-      <w:r>
-        <w:rPr>
-          <w:sz w:val="20"/>
-          <w:szCs w:val="20"/>
-        </w:rPr>
-        <w:t>/ingredients/search/name/{name} | Search by name |</w:t>
+        <w:t>| GET | /api/ingredients | Get all ingredients |</w:t>
+      </w:r>
+    </w:p>
+    <w:p>
+      <w:pPr>
+        <w:spacing w:after="0"/>
+        <w:rPr>
+          <w:sz w:val="20"/>
+          <w:szCs w:val="20"/>
+        </w:rPr>
+      </w:pPr>
+      <w:r>
+        <w:rPr>
+          <w:sz w:val="20"/>
+          <w:szCs w:val="20"/>
+        </w:rPr>
+        <w:t>| GET | /api/ingredients/{id} | Get ingredient by ID |</w:t>
+      </w:r>
+    </w:p>
+    <w:p>
+      <w:pPr>
+        <w:spacing w:after="0"/>
+        <w:rPr>
+          <w:sz w:val="20"/>
+          <w:szCs w:val="20"/>
+        </w:rPr>
+      </w:pPr>
+      <w:r>
+        <w:rPr>
+          <w:sz w:val="20"/>
+          <w:szCs w:val="20"/>
+        </w:rPr>
+        <w:t>| GET | /api/ingredients/search | Search with query params: name, origin, minPrice, maxPrice, minProtein, maxProtein, minFats, maxFats |</w:t>
+      </w:r>
+    </w:p>
+    <w:p>
+      <w:pPr>
+        <w:spacing w:after="0"/>
+        <w:rPr>
+          <w:sz w:val="20"/>
+          <w:szCs w:val="20"/>
+        </w:rPr>
+      </w:pPr>
+      <w:r>
+        <w:rPr>
+          <w:sz w:val="20"/>
+          <w:szCs w:val="20"/>
+        </w:rPr>
+        <w:t>| GET | /api/ingredients/search/name/{name} | Search by name |</w:t>
       </w:r>
     </w:p>
     <w:p>
@@ -2697,408 +1773,453 @@
           <w:szCs w:val="20"/>
         </w:rPr>
         <w:lastRenderedPageBreak/>
-        <w:t>| GET | /</w:t>
-      </w:r>
-      <w:proofErr w:type="spellStart"/>
-      <w:r>
-        <w:rPr>
-          <w:sz w:val="20"/>
-          <w:szCs w:val="20"/>
-        </w:rPr>
-        <w:t>api</w:t>
-      </w:r>
-      <w:proofErr w:type="spellEnd"/>
-      <w:r>
-        <w:rPr>
-          <w:sz w:val="20"/>
-          <w:szCs w:val="20"/>
-        </w:rPr>
-        <w:t>/ingredients/search/origin/{origin} | Filter by origin |</w:t>
-      </w:r>
-    </w:p>
-    <w:p>
-      <w:pPr>
-        <w:spacing w:after="0"/>
-        <w:rPr>
-          <w:sz w:val="20"/>
-          <w:szCs w:val="20"/>
-        </w:rPr>
-      </w:pPr>
-      <w:r>
-        <w:rPr>
-          <w:sz w:val="20"/>
-          <w:szCs w:val="20"/>
-        </w:rPr>
-        <w:t>| GET | /</w:t>
-      </w:r>
-      <w:proofErr w:type="spellStart"/>
-      <w:r>
-        <w:rPr>
-          <w:sz w:val="20"/>
-          <w:szCs w:val="20"/>
-        </w:rPr>
-        <w:t>api</w:t>
-      </w:r>
-      <w:proofErr w:type="spellEnd"/>
-      <w:r>
-        <w:rPr>
-          <w:sz w:val="20"/>
-          <w:szCs w:val="20"/>
-        </w:rPr>
-        <w:t>/ingredients/search/price/{</w:t>
-      </w:r>
-      <w:proofErr w:type="spellStart"/>
-      <w:r>
-        <w:rPr>
-          <w:sz w:val="20"/>
-          <w:szCs w:val="20"/>
-        </w:rPr>
-        <w:t>maxPrice</w:t>
-      </w:r>
-      <w:proofErr w:type="spellEnd"/>
-      <w:r>
-        <w:rPr>
-          <w:sz w:val="20"/>
-          <w:szCs w:val="20"/>
-        </w:rPr>
-        <w:t>} | Filter by max price |</w:t>
-      </w:r>
-    </w:p>
-    <w:p>
-      <w:pPr>
-        <w:spacing w:after="0"/>
-        <w:rPr>
-          <w:sz w:val="20"/>
-          <w:szCs w:val="20"/>
-        </w:rPr>
-      </w:pPr>
-      <w:r>
-        <w:rPr>
-          <w:sz w:val="20"/>
-          <w:szCs w:val="20"/>
-        </w:rPr>
-        <w:t>| GET | /</w:t>
-      </w:r>
-      <w:proofErr w:type="spellStart"/>
-      <w:r>
-        <w:rPr>
-          <w:sz w:val="20"/>
-          <w:szCs w:val="20"/>
-        </w:rPr>
-        <w:t>api</w:t>
-      </w:r>
-      <w:proofErr w:type="spellEnd"/>
-      <w:r>
-        <w:rPr>
-          <w:sz w:val="20"/>
-          <w:szCs w:val="20"/>
-        </w:rPr>
-        <w:t>/ingredients/search/protein/{</w:t>
-      </w:r>
-      <w:proofErr w:type="spellStart"/>
-      <w:r>
-        <w:rPr>
-          <w:sz w:val="20"/>
-          <w:szCs w:val="20"/>
-        </w:rPr>
-        <w:t>minProtein</w:t>
-      </w:r>
-      <w:proofErr w:type="spellEnd"/>
-      <w:r>
-        <w:rPr>
-          <w:sz w:val="20"/>
-          <w:szCs w:val="20"/>
-        </w:rPr>
-        <w:t>} | Filter by min protein |</w:t>
-      </w:r>
-    </w:p>
-    <w:p>
-      <w:pPr>
-        <w:spacing w:after="0"/>
-        <w:rPr>
-          <w:sz w:val="20"/>
-          <w:szCs w:val="20"/>
-        </w:rPr>
-      </w:pPr>
-      <w:r>
-        <w:rPr>
-          <w:sz w:val="20"/>
-          <w:szCs w:val="20"/>
-        </w:rPr>
-        <w:t>| GET | /</w:t>
-      </w:r>
-      <w:proofErr w:type="spellStart"/>
-      <w:r>
-        <w:rPr>
-          <w:sz w:val="20"/>
-          <w:szCs w:val="20"/>
-        </w:rPr>
-        <w:t>api</w:t>
-      </w:r>
-      <w:proofErr w:type="spellEnd"/>
-      <w:r>
-        <w:rPr>
-          <w:sz w:val="20"/>
-          <w:szCs w:val="20"/>
-        </w:rPr>
-        <w:t>/ingredients/search/fat/{</w:t>
-      </w:r>
-      <w:proofErr w:type="spellStart"/>
-      <w:r>
-        <w:rPr>
-          <w:sz w:val="20"/>
-          <w:szCs w:val="20"/>
-        </w:rPr>
-        <w:t>minFat</w:t>
-      </w:r>
-      <w:proofErr w:type="spellEnd"/>
-      <w:r>
-        <w:rPr>
-          <w:sz w:val="20"/>
-          <w:szCs w:val="20"/>
-        </w:rPr>
-        <w:t>} | Filter by min fat |</w:t>
-      </w:r>
-    </w:p>
-    <w:p>
-      <w:pPr>
-        <w:spacing w:after="0"/>
-        <w:rPr>
-          <w:sz w:val="20"/>
-          <w:szCs w:val="20"/>
-        </w:rPr>
-      </w:pPr>
-      <w:r>
-        <w:rPr>
-          <w:sz w:val="20"/>
-          <w:szCs w:val="20"/>
-        </w:rPr>
-        <w:t>| GET | /</w:t>
-      </w:r>
-      <w:proofErr w:type="spellStart"/>
-      <w:r>
-        <w:rPr>
-          <w:sz w:val="20"/>
-          <w:szCs w:val="20"/>
-        </w:rPr>
-        <w:t>api</w:t>
-      </w:r>
-      <w:proofErr w:type="spellEnd"/>
-      <w:r>
-        <w:rPr>
-          <w:sz w:val="20"/>
-          <w:szCs w:val="20"/>
-        </w:rPr>
-        <w:t>/ingredients/</w:t>
-      </w:r>
-      <w:proofErr w:type="spellStart"/>
-      <w:r>
-        <w:rPr>
-          <w:sz w:val="20"/>
-          <w:szCs w:val="20"/>
-        </w:rPr>
-        <w:t>isOrganic</w:t>
-      </w:r>
-      <w:proofErr w:type="spellEnd"/>
-      <w:r>
-        <w:rPr>
-          <w:sz w:val="20"/>
-          <w:szCs w:val="20"/>
-        </w:rPr>
-        <w:t>/{</w:t>
-      </w:r>
-      <w:proofErr w:type="spellStart"/>
-      <w:r>
-        <w:rPr>
-          <w:sz w:val="20"/>
-          <w:szCs w:val="20"/>
-        </w:rPr>
-        <w:t>isOrganic</w:t>
-      </w:r>
-      <w:proofErr w:type="spellEnd"/>
-      <w:r>
-        <w:rPr>
-          <w:sz w:val="20"/>
-          <w:szCs w:val="20"/>
-        </w:rPr>
-        <w:t>} | Filter by organic status |</w:t>
-      </w:r>
-    </w:p>
-    <w:p>
-      <w:pPr>
-        <w:spacing w:after="0"/>
-        <w:rPr>
-          <w:sz w:val="20"/>
-          <w:szCs w:val="20"/>
-        </w:rPr>
-      </w:pPr>
-      <w:r>
-        <w:rPr>
-          <w:sz w:val="20"/>
-          <w:szCs w:val="20"/>
-        </w:rPr>
-        <w:t>| GET | /</w:t>
-      </w:r>
-      <w:proofErr w:type="spellStart"/>
-      <w:r>
-        <w:rPr>
-          <w:sz w:val="20"/>
-          <w:szCs w:val="20"/>
-        </w:rPr>
-        <w:t>api</w:t>
-      </w:r>
-      <w:proofErr w:type="spellEnd"/>
-      <w:r>
-        <w:rPr>
-          <w:sz w:val="20"/>
-          <w:szCs w:val="20"/>
-        </w:rPr>
-        <w:t xml:space="preserve">/ingredients/page | Paginated results (query params: page, </w:t>
-      </w:r>
-      <w:proofErr w:type="spellStart"/>
-      <w:r>
-        <w:rPr>
-          <w:sz w:val="20"/>
-          <w:szCs w:val="20"/>
-        </w:rPr>
-        <w:t>pageSize</w:t>
-      </w:r>
-      <w:proofErr w:type="spellEnd"/>
-      <w:r>
-        <w:rPr>
-          <w:sz w:val="20"/>
-          <w:szCs w:val="20"/>
-        </w:rPr>
-        <w:t>) |</w:t>
-      </w:r>
-    </w:p>
-    <w:p>
-      <w:pPr>
-        <w:spacing w:after="0"/>
-        <w:rPr>
-          <w:sz w:val="20"/>
-          <w:szCs w:val="20"/>
-        </w:rPr>
-      </w:pPr>
-      <w:r>
-        <w:rPr>
-          <w:sz w:val="20"/>
-          <w:szCs w:val="20"/>
-        </w:rPr>
-        <w:t>| POST | /</w:t>
-      </w:r>
-      <w:proofErr w:type="spellStart"/>
-      <w:r>
-        <w:rPr>
-          <w:sz w:val="20"/>
-          <w:szCs w:val="20"/>
-        </w:rPr>
-        <w:t>api</w:t>
-      </w:r>
-      <w:proofErr w:type="spellEnd"/>
-      <w:r>
-        <w:rPr>
-          <w:sz w:val="20"/>
-          <w:szCs w:val="20"/>
-        </w:rPr>
-        <w:t>/ingredients | Add a new ingredient |</w:t>
-      </w:r>
-    </w:p>
-    <w:p>
-      <w:pPr>
-        <w:spacing w:after="0"/>
-        <w:rPr>
-          <w:sz w:val="20"/>
-          <w:szCs w:val="20"/>
-        </w:rPr>
-      </w:pPr>
-      <w:r>
-        <w:rPr>
-          <w:sz w:val="20"/>
-          <w:szCs w:val="20"/>
-        </w:rPr>
-        <w:t>| PUT | /</w:t>
-      </w:r>
-      <w:proofErr w:type="spellStart"/>
-      <w:r>
-        <w:rPr>
-          <w:sz w:val="20"/>
-          <w:szCs w:val="20"/>
-        </w:rPr>
-        <w:t>api</w:t>
-      </w:r>
-      <w:proofErr w:type="spellEnd"/>
-      <w:r>
-        <w:rPr>
-          <w:sz w:val="20"/>
-          <w:szCs w:val="20"/>
-        </w:rPr>
-        <w:t>/ingredients/{id} | Full update of an ingredient |</w:t>
-      </w:r>
-    </w:p>
-    <w:p>
-      <w:pPr>
-        <w:spacing w:after="0"/>
-        <w:rPr>
-          <w:sz w:val="20"/>
-          <w:szCs w:val="20"/>
-        </w:rPr>
-      </w:pPr>
-      <w:r>
-        <w:rPr>
-          <w:sz w:val="20"/>
-          <w:szCs w:val="20"/>
-        </w:rPr>
-        <w:t>| PUT | /</w:t>
-      </w:r>
-      <w:proofErr w:type="spellStart"/>
-      <w:r>
-        <w:rPr>
-          <w:sz w:val="20"/>
-          <w:szCs w:val="20"/>
-        </w:rPr>
-        <w:t>api</w:t>
-      </w:r>
-      <w:proofErr w:type="spellEnd"/>
-      <w:r>
-        <w:rPr>
-          <w:sz w:val="20"/>
-          <w:szCs w:val="20"/>
-        </w:rPr>
-        <w:t>/ingredients/simple-update/{id} | Update name and price only |</w:t>
-      </w:r>
-    </w:p>
-    <w:p>
-      <w:pPr>
-        <w:spacing w:after="0"/>
-        <w:rPr>
-          <w:sz w:val="20"/>
-          <w:szCs w:val="20"/>
-        </w:rPr>
-      </w:pPr>
-      <w:r>
-        <w:rPr>
-          <w:sz w:val="20"/>
-          <w:szCs w:val="20"/>
-        </w:rPr>
-        <w:t>| DELETE | /</w:t>
-      </w:r>
-      <w:proofErr w:type="spellStart"/>
-      <w:r>
-        <w:rPr>
-          <w:sz w:val="20"/>
-          <w:szCs w:val="20"/>
-        </w:rPr>
-        <w:t>api</w:t>
-      </w:r>
-      <w:proofErr w:type="spellEnd"/>
-      <w:r>
-        <w:rPr>
-          <w:sz w:val="20"/>
-          <w:szCs w:val="20"/>
-        </w:rPr>
-        <w:t>/ingredients/{id} | Delete an ingredient |</w:t>
-      </w:r>
+        <w:t>| GET | /api/ingredients/search/origin/{origin} | Filter by origin |</w:t>
+      </w:r>
+    </w:p>
+    <w:p>
+      <w:pPr>
+        <w:spacing w:after="0"/>
+        <w:rPr>
+          <w:sz w:val="20"/>
+          <w:szCs w:val="20"/>
+        </w:rPr>
+      </w:pPr>
+      <w:r>
+        <w:rPr>
+          <w:sz w:val="20"/>
+          <w:szCs w:val="20"/>
+        </w:rPr>
+        <w:t>| GET | /api/ingredients/search/price/{maxPrice} | Filter by max price |</w:t>
+      </w:r>
+    </w:p>
+    <w:p>
+      <w:pPr>
+        <w:spacing w:after="0"/>
+        <w:rPr>
+          <w:sz w:val="20"/>
+          <w:szCs w:val="20"/>
+        </w:rPr>
+      </w:pPr>
+      <w:r>
+        <w:rPr>
+          <w:sz w:val="20"/>
+          <w:szCs w:val="20"/>
+        </w:rPr>
+        <w:t>| GET | /api/ingredients/search/protein/{minProtein} | Filter by min protein |</w:t>
+      </w:r>
+    </w:p>
+    <w:p>
+      <w:pPr>
+        <w:spacing w:after="0"/>
+        <w:rPr>
+          <w:sz w:val="20"/>
+          <w:szCs w:val="20"/>
+        </w:rPr>
+      </w:pPr>
+      <w:r>
+        <w:rPr>
+          <w:sz w:val="20"/>
+          <w:szCs w:val="20"/>
+        </w:rPr>
+        <w:t>| GET | /api/ingredients/search/fat/{minFat} | Filter by min fat |</w:t>
+      </w:r>
+    </w:p>
+    <w:p>
+      <w:pPr>
+        <w:spacing w:after="0"/>
+        <w:rPr>
+          <w:sz w:val="20"/>
+          <w:szCs w:val="20"/>
+        </w:rPr>
+      </w:pPr>
+      <w:r>
+        <w:rPr>
+          <w:sz w:val="20"/>
+          <w:szCs w:val="20"/>
+        </w:rPr>
+        <w:t>| GET | /api/ingredients/isOrganic/{isOrganic} | Filter by organic status |</w:t>
+      </w:r>
+    </w:p>
+    <w:p>
+      <w:pPr>
+        <w:spacing w:after="0"/>
+        <w:rPr>
+          <w:sz w:val="20"/>
+          <w:szCs w:val="20"/>
+        </w:rPr>
+      </w:pPr>
+      <w:r>
+        <w:rPr>
+          <w:sz w:val="20"/>
+          <w:szCs w:val="20"/>
+        </w:rPr>
+        <w:t>| GET | /api/ingredients/page | Paginated results (query params: page, pageSize) |</w:t>
+      </w:r>
+    </w:p>
+    <w:p>
+      <w:pPr>
+        <w:spacing w:after="0"/>
+        <w:rPr>
+          <w:sz w:val="20"/>
+          <w:szCs w:val="20"/>
+        </w:rPr>
+      </w:pPr>
+      <w:r>
+        <w:rPr>
+          <w:sz w:val="20"/>
+          <w:szCs w:val="20"/>
+        </w:rPr>
+        <w:t>| POST | /api/ingredients | Add a new ingredient |</w:t>
+      </w:r>
+    </w:p>
+    <w:p>
+      <w:pPr>
+        <w:spacing w:after="0"/>
+        <w:rPr>
+          <w:sz w:val="20"/>
+          <w:szCs w:val="20"/>
+        </w:rPr>
+      </w:pPr>
+      <w:r>
+        <w:rPr>
+          <w:sz w:val="20"/>
+          <w:szCs w:val="20"/>
+        </w:rPr>
+        <w:t>| PUT | /api/ingredients/{id} | Full update of an ingredient |</w:t>
+      </w:r>
+    </w:p>
+    <w:p>
+      <w:pPr>
+        <w:spacing w:after="0"/>
+        <w:rPr>
+          <w:sz w:val="20"/>
+          <w:szCs w:val="20"/>
+        </w:rPr>
+      </w:pPr>
+      <w:r>
+        <w:rPr>
+          <w:sz w:val="20"/>
+          <w:szCs w:val="20"/>
+        </w:rPr>
+        <w:t>| PUT | /api/ingredients/simple-update/{id} | Update name and price only |</w:t>
+      </w:r>
+    </w:p>
+    <w:p>
+      <w:pPr>
+        <w:spacing w:after="0"/>
+        <w:rPr>
+          <w:sz w:val="20"/>
+          <w:szCs w:val="20"/>
+        </w:rPr>
+      </w:pPr>
+      <w:r>
+        <w:rPr>
+          <w:sz w:val="20"/>
+          <w:szCs w:val="20"/>
+        </w:rPr>
+        <w:t>| DELETE | /api/ingredients/{id} | Delete an ingredient |</w:t>
+      </w:r>
+    </w:p>
+    <w:p>
+      <w:pPr>
+        <w:spacing w:after="0"/>
+      </w:pPr>
+    </w:p>
+    <w:p>
+      <w:pPr>
+        <w:spacing w:after="0"/>
+      </w:pPr>
+    </w:p>
+    <w:p>
+      <w:pPr>
+        <w:spacing w:after="0"/>
+      </w:pPr>
+      <w:r>
+        <w:t>Tests</w:t>
+      </w:r>
+    </w:p>
+    <w:p>
+      <w:pPr>
+        <w:spacing w:after="0"/>
+      </w:pPr>
+    </w:p>
+    <w:p>
+      <w:pPr>
+        <w:spacing w:after="0"/>
+      </w:pPr>
+      <w:r>
+        <w:rPr>
+          <w:noProof/>
+        </w:rPr>
+        <w:lastRenderedPageBreak/>
+        <w:drawing>
+          <wp:inline distT="0" distB="0" distL="0" distR="0" wp14:anchorId="7D8E49AD" wp14:editId="10A6B8CA">
+            <wp:extent cx="5943600" cy="3196590"/>
+            <wp:effectExtent l="0" t="0" r="0" b="3810"/>
+            <wp:docPr id="233581202" name="Picture 5"/>
+            <wp:cNvGraphicFramePr>
+              <a:graphicFrameLocks xmlns:a="http://schemas.openxmlformats.org/drawingml/2006/main" noChangeAspect="1"/>
+            </wp:cNvGraphicFramePr>
+            <a:graphic xmlns:a="http://schemas.openxmlformats.org/drawingml/2006/main">
+              <a:graphicData uri="http://schemas.openxmlformats.org/drawingml/2006/picture">
+                <pic:pic xmlns:pic="http://schemas.openxmlformats.org/drawingml/2006/picture">
+                  <pic:nvPicPr>
+                    <pic:cNvPr id="0" name="Picture 5"/>
+                    <pic:cNvPicPr>
+                      <a:picLocks noChangeAspect="1" noChangeArrowheads="1"/>
+                    </pic:cNvPicPr>
+                  </pic:nvPicPr>
+                  <pic:blipFill>
+                    <a:blip r:embed="rId8" cstate="print">
+                      <a:extLst>
+                        <a:ext uri="{28A0092B-C50C-407E-A947-70E740481C1C}">
+                          <a14:useLocalDpi xmlns:a14="http://schemas.microsoft.com/office/drawing/2010/main" val="0"/>
+                        </a:ext>
+                      </a:extLst>
+                    </a:blip>
+                    <a:srcRect/>
+                    <a:stretch>
+                      <a:fillRect/>
+                    </a:stretch>
+                  </pic:blipFill>
+                  <pic:spPr bwMode="auto">
+                    <a:xfrm>
+                      <a:off x="0" y="0"/>
+                      <a:ext cx="5943600" cy="3196590"/>
+                    </a:xfrm>
+                    <a:prstGeom prst="rect">
+                      <a:avLst/>
+                    </a:prstGeom>
+                    <a:noFill/>
+                    <a:ln>
+                      <a:noFill/>
+                    </a:ln>
+                  </pic:spPr>
+                </pic:pic>
+              </a:graphicData>
+            </a:graphic>
+          </wp:inline>
+        </w:drawing>
+      </w:r>
+      <w:r>
+        <w:rPr>
+          <w:noProof/>
+        </w:rPr>
+        <w:drawing>
+          <wp:inline distT="0" distB="0" distL="0" distR="0" wp14:anchorId="56AD7FFC" wp14:editId="7F7A449A">
+            <wp:extent cx="5943600" cy="3196590"/>
+            <wp:effectExtent l="0" t="0" r="0" b="3810"/>
+            <wp:docPr id="1575273252" name="Picture 4"/>
+            <wp:cNvGraphicFramePr>
+              <a:graphicFrameLocks xmlns:a="http://schemas.openxmlformats.org/drawingml/2006/main" noChangeAspect="1"/>
+            </wp:cNvGraphicFramePr>
+            <a:graphic xmlns:a="http://schemas.openxmlformats.org/drawingml/2006/main">
+              <a:graphicData uri="http://schemas.openxmlformats.org/drawingml/2006/picture">
+                <pic:pic xmlns:pic="http://schemas.openxmlformats.org/drawingml/2006/picture">
+                  <pic:nvPicPr>
+                    <pic:cNvPr id="0" name="Picture 4"/>
+                    <pic:cNvPicPr>
+                      <a:picLocks noChangeAspect="1" noChangeArrowheads="1"/>
+                    </pic:cNvPicPr>
+                  </pic:nvPicPr>
+                  <pic:blipFill>
+                    <a:blip r:embed="rId9" cstate="print">
+                      <a:extLst>
+                        <a:ext uri="{28A0092B-C50C-407E-A947-70E740481C1C}">
+                          <a14:useLocalDpi xmlns:a14="http://schemas.microsoft.com/office/drawing/2010/main" val="0"/>
+                        </a:ext>
+                      </a:extLst>
+                    </a:blip>
+                    <a:srcRect/>
+                    <a:stretch>
+                      <a:fillRect/>
+                    </a:stretch>
+                  </pic:blipFill>
+                  <pic:spPr bwMode="auto">
+                    <a:xfrm>
+                      <a:off x="0" y="0"/>
+                      <a:ext cx="5943600" cy="3196590"/>
+                    </a:xfrm>
+                    <a:prstGeom prst="rect">
+                      <a:avLst/>
+                    </a:prstGeom>
+                    <a:noFill/>
+                    <a:ln>
+                      <a:noFill/>
+                    </a:ln>
+                  </pic:spPr>
+                </pic:pic>
+              </a:graphicData>
+            </a:graphic>
+          </wp:inline>
+        </w:drawing>
+      </w:r>
+      <w:r>
+        <w:rPr>
+          <w:noProof/>
+        </w:rPr>
+        <w:lastRenderedPageBreak/>
+        <w:drawing>
+          <wp:inline distT="0" distB="0" distL="0" distR="0" wp14:anchorId="5913D66A" wp14:editId="446C07F6">
+            <wp:extent cx="5943600" cy="3196590"/>
+            <wp:effectExtent l="0" t="0" r="0" b="3810"/>
+            <wp:docPr id="1226409852" name="Picture 3"/>
+            <wp:cNvGraphicFramePr>
+              <a:graphicFrameLocks xmlns:a="http://schemas.openxmlformats.org/drawingml/2006/main" noChangeAspect="1"/>
+            </wp:cNvGraphicFramePr>
+            <a:graphic xmlns:a="http://schemas.openxmlformats.org/drawingml/2006/main">
+              <a:graphicData uri="http://schemas.openxmlformats.org/drawingml/2006/picture">
+                <pic:pic xmlns:pic="http://schemas.openxmlformats.org/drawingml/2006/picture">
+                  <pic:nvPicPr>
+                    <pic:cNvPr id="0" name="Picture 3"/>
+                    <pic:cNvPicPr>
+                      <a:picLocks noChangeAspect="1" noChangeArrowheads="1"/>
+                    </pic:cNvPicPr>
+                  </pic:nvPicPr>
+                  <pic:blipFill>
+                    <a:blip r:embed="rId10" cstate="print">
+                      <a:extLst>
+                        <a:ext uri="{28A0092B-C50C-407E-A947-70E740481C1C}">
+                          <a14:useLocalDpi xmlns:a14="http://schemas.microsoft.com/office/drawing/2010/main" val="0"/>
+                        </a:ext>
+                      </a:extLst>
+                    </a:blip>
+                    <a:srcRect/>
+                    <a:stretch>
+                      <a:fillRect/>
+                    </a:stretch>
+                  </pic:blipFill>
+                  <pic:spPr bwMode="auto">
+                    <a:xfrm>
+                      <a:off x="0" y="0"/>
+                      <a:ext cx="5943600" cy="3196590"/>
+                    </a:xfrm>
+                    <a:prstGeom prst="rect">
+                      <a:avLst/>
+                    </a:prstGeom>
+                    <a:noFill/>
+                    <a:ln>
+                      <a:noFill/>
+                    </a:ln>
+                  </pic:spPr>
+                </pic:pic>
+              </a:graphicData>
+            </a:graphic>
+          </wp:inline>
+        </w:drawing>
+      </w:r>
+      <w:r>
+        <w:rPr>
+          <w:noProof/>
+        </w:rPr>
+        <w:drawing>
+          <wp:inline distT="0" distB="0" distL="0" distR="0" wp14:anchorId="6915819D" wp14:editId="37409A4B">
+            <wp:extent cx="5943600" cy="3196590"/>
+            <wp:effectExtent l="0" t="0" r="0" b="3810"/>
+            <wp:docPr id="355252528" name="Picture 2"/>
+            <wp:cNvGraphicFramePr>
+              <a:graphicFrameLocks xmlns:a="http://schemas.openxmlformats.org/drawingml/2006/main" noChangeAspect="1"/>
+            </wp:cNvGraphicFramePr>
+            <a:graphic xmlns:a="http://schemas.openxmlformats.org/drawingml/2006/main">
+              <a:graphicData uri="http://schemas.openxmlformats.org/drawingml/2006/picture">
+                <pic:pic xmlns:pic="http://schemas.openxmlformats.org/drawingml/2006/picture">
+                  <pic:nvPicPr>
+                    <pic:cNvPr id="0" name="Picture 2"/>
+                    <pic:cNvPicPr>
+                      <a:picLocks noChangeAspect="1" noChangeArrowheads="1"/>
+                    </pic:cNvPicPr>
+                  </pic:nvPicPr>
+                  <pic:blipFill>
+                    <a:blip r:embed="rId11" cstate="print">
+                      <a:extLst>
+                        <a:ext uri="{28A0092B-C50C-407E-A947-70E740481C1C}">
+                          <a14:useLocalDpi xmlns:a14="http://schemas.microsoft.com/office/drawing/2010/main" val="0"/>
+                        </a:ext>
+                      </a:extLst>
+                    </a:blip>
+                    <a:srcRect/>
+                    <a:stretch>
+                      <a:fillRect/>
+                    </a:stretch>
+                  </pic:blipFill>
+                  <pic:spPr bwMode="auto">
+                    <a:xfrm>
+                      <a:off x="0" y="0"/>
+                      <a:ext cx="5943600" cy="3196590"/>
+                    </a:xfrm>
+                    <a:prstGeom prst="rect">
+                      <a:avLst/>
+                    </a:prstGeom>
+                    <a:noFill/>
+                    <a:ln>
+                      <a:noFill/>
+                    </a:ln>
+                  </pic:spPr>
+                </pic:pic>
+              </a:graphicData>
+            </a:graphic>
+          </wp:inline>
+        </w:drawing>
+      </w:r>
+      <w:r>
+        <w:rPr>
+          <w:noProof/>
+        </w:rPr>
+        <w:lastRenderedPageBreak/>
+        <w:drawing>
+          <wp:inline distT="0" distB="0" distL="0" distR="0" wp14:anchorId="791A4D75" wp14:editId="5605CAC4">
+            <wp:extent cx="5943600" cy="3196590"/>
+            <wp:effectExtent l="0" t="0" r="0" b="3810"/>
+            <wp:docPr id="856938571" name="Picture 1"/>
+            <wp:cNvGraphicFramePr>
+              <a:graphicFrameLocks xmlns:a="http://schemas.openxmlformats.org/drawingml/2006/main" noChangeAspect="1"/>
+            </wp:cNvGraphicFramePr>
+            <a:graphic xmlns:a="http://schemas.openxmlformats.org/drawingml/2006/main">
+              <a:graphicData uri="http://schemas.openxmlformats.org/drawingml/2006/picture">
+                <pic:pic xmlns:pic="http://schemas.openxmlformats.org/drawingml/2006/picture">
+                  <pic:nvPicPr>
+                    <pic:cNvPr id="0" name="Picture 1"/>
+                    <pic:cNvPicPr>
+                      <a:picLocks noChangeAspect="1" noChangeArrowheads="1"/>
+                    </pic:cNvPicPr>
+                  </pic:nvPicPr>
+                  <pic:blipFill>
+                    <a:blip r:embed="rId12" cstate="print">
+                      <a:extLst>
+                        <a:ext uri="{28A0092B-C50C-407E-A947-70E740481C1C}">
+                          <a14:useLocalDpi xmlns:a14="http://schemas.microsoft.com/office/drawing/2010/main" val="0"/>
+                        </a:ext>
+                      </a:extLst>
+                    </a:blip>
+                    <a:srcRect/>
+                    <a:stretch>
+                      <a:fillRect/>
+                    </a:stretch>
+                  </pic:blipFill>
+                  <pic:spPr bwMode="auto">
+                    <a:xfrm>
+                      <a:off x="0" y="0"/>
+                      <a:ext cx="5943600" cy="3196590"/>
+                    </a:xfrm>
+                    <a:prstGeom prst="rect">
+                      <a:avLst/>
+                    </a:prstGeom>
+                    <a:noFill/>
+                    <a:ln>
+                      <a:noFill/>
+                    </a:ln>
+                  </pic:spPr>
+                </pic:pic>
+              </a:graphicData>
+            </a:graphic>
+          </wp:inline>
+        </w:drawing>
+      </w:r>
+    </w:p>
+    <w:p>
+      <w:pPr>
+        <w:spacing w:after="0"/>
+      </w:pPr>
     </w:p>
     <w:p>
       <w:pPr>
@@ -3106,7 +2227,7 @@
       </w:pPr>
     </w:p>
     <w:sectPr>
-      <w:headerReference w:type="default" r:id="rId8"/>
+      <w:headerReference w:type="default" r:id="rId13"/>
       <w:pgSz w:w="12240" w:h="15840"/>
       <w:pgMar w:top="1440" w:right="1440" w:bottom="1440" w:left="1440" w:header="720" w:footer="720" w:gutter="0"/>
       <w:cols w:space="720"/>
@@ -3780,6 +2901,7 @@
   <w:style w:type="character" w:default="1" w:styleId="DefaultParagraphFont">
     <w:name w:val="Default Paragraph Font"/>
     <w:uiPriority w:val="1"/>
+    <w:semiHidden/>
     <w:unhideWhenUsed/>
   </w:style>
   <w:style w:type="table" w:default="1" w:styleId="TableNormal">

</xml_diff>